<commit_message>
ADICIONANDO DADOS DO CÓDIGO DE LIMEPZA
</commit_message>
<xml_diff>
--- a/Checkpoint1.docx
+++ b/Checkpoint1.docx
@@ -1,6 +1,6 @@
 
 <file path=word/document.xml><?xml version="1.0" encoding="utf-8"?>
-<w:document xmlns:wpc="http://schemas.microsoft.com/office/word/2010/wordprocessingCanvas" xmlns:cx="http://schemas.microsoft.com/office/drawing/2014/chartex" xmlns:cx1="http://schemas.microsoft.com/office/drawing/2015/9/8/chartex" xmlns:cx2="http://schemas.microsoft.com/office/drawing/2015/10/21/chartex" xmlns:cx3="http://schemas.microsoft.com/office/drawing/2016/5/9/chartex" xmlns:cx4="http://schemas.microsoft.com/office/drawing/2016/5/10/chartex" xmlns:cx5="http://schemas.microsoft.com/office/drawing/2016/5/11/chartex" xmlns:cx6="http://schemas.microsoft.com/office/drawing/2016/5/12/chartex" xmlns:cx7="http://schemas.microsoft.com/office/drawing/2016/5/13/chartex" xmlns:cx8="http://schemas.microsoft.com/office/drawing/2016/5/14/chartex" xmlns:mc="http://schemas.openxmlformats.org/markup-compatibility/2006" xmlns:aink="http://schemas.microsoft.com/office/drawing/2016/ink" xmlns:am3d="http://schemas.microsoft.com/office/drawing/2017/model3d" xmlns:o="urn:schemas-microsoft-com:office:office" xmlns:oel="http://schemas.microsoft.com/office/2019/extlst" xmlns:r="http://schemas.openxmlformats.org/officeDocument/2006/relationships" xmlns:m="http://schemas.openxmlformats.org/officeDocument/2006/math" xmlns:v="urn:schemas-microsoft-com:vml" xmlns:wp14="http://schemas.microsoft.com/office/word/2010/wordprocessingDrawing" xmlns:wp="http://schemas.openxmlformats.org/drawingml/2006/wordprocessingDrawing" xmlns:w10="urn:schemas-microsoft-com:office:word" xmlns:w="http://schemas.openxmlformats.org/wordprocessingml/2006/main" xmlns:w14="http://schemas.microsoft.com/office/word/2010/wordml" xmlns:w15="http://schemas.microsoft.com/office/word/2012/wordml" xmlns:w16cex="http://schemas.microsoft.com/office/word/2018/wordml/cex" xmlns:w16cid="http://schemas.microsoft.com/office/word/2016/wordml/cid" xmlns:w16="http://schemas.microsoft.com/office/word/2018/wordml" xmlns:w16du="http://schemas.microsoft.com/office/word/2023/wordml/word16du" xmlns:w16sdtdh="http://schemas.microsoft.com/office/word/2020/wordml/sdtdatahash" xmlns:w16sdtfl="http://schemas.microsoft.com/office/word/2024/wordml/sdtformatlock" xmlns:w16se="http://schemas.microsoft.com/office/word/2015/wordml/symex" xmlns:wpg="http://schemas.microsoft.com/office/word/2010/wordprocessingGroup" xmlns:wpi="http://schemas.microsoft.com/office/word/2010/wordprocessingInk" xmlns:wne="http://schemas.microsoft.com/office/word/2006/wordml" xmlns:wps="http://schemas.microsoft.com/office/word/2010/wordprocessingShape" mc:Ignorable="w14 w15 w16se w16cid w16 w16cex w16sdtdh w16sdtfl w16du wp14">
+<w:document xmlns:wpc="http://schemas.microsoft.com/office/word/2010/wordprocessingCanvas" xmlns:cx="http://schemas.microsoft.com/office/drawing/2014/chartex" xmlns:cx1="http://schemas.microsoft.com/office/drawing/2015/9/8/chartex" xmlns:cx2="http://schemas.microsoft.com/office/drawing/2015/10/21/chartex" xmlns:cx3="http://schemas.microsoft.com/office/drawing/2016/5/9/chartex" xmlns:cx4="http://schemas.microsoft.com/office/drawing/2016/5/10/chartex" xmlns:cx5="http://schemas.microsoft.com/office/drawing/2016/5/11/chartex" xmlns:cx6="http://schemas.microsoft.com/office/drawing/2016/5/12/chartex" xmlns:cx7="http://schemas.microsoft.com/office/drawing/2016/5/13/chartex" xmlns:cx8="http://schemas.microsoft.com/office/drawing/2016/5/14/chartex" xmlns:mc="http://schemas.openxmlformats.org/markup-compatibility/2006" xmlns:aink="http://schemas.microsoft.com/office/drawing/2016/ink" xmlns:am3d="http://schemas.microsoft.com/office/drawing/2017/model3d" xmlns:o="urn:schemas-microsoft-com:office:office" xmlns:r="http://schemas.openxmlformats.org/officeDocument/2006/relationships" xmlns:m="http://schemas.openxmlformats.org/officeDocument/2006/math" xmlns:v="urn:schemas-microsoft-com:vml" xmlns:wp14="http://schemas.microsoft.com/office/word/2010/wordprocessingDrawing" xmlns:wp="http://schemas.openxmlformats.org/drawingml/2006/wordprocessingDrawing" xmlns:w10="urn:schemas-microsoft-com:office:word" xmlns:w="http://schemas.openxmlformats.org/wordprocessingml/2006/main" xmlns:w14="http://schemas.microsoft.com/office/word/2010/wordml" xmlns:w15="http://schemas.microsoft.com/office/word/2012/wordml" xmlns:w16cex="http://schemas.microsoft.com/office/word/2018/wordml/cex" xmlns:w16cid="http://schemas.microsoft.com/office/word/2016/wordml/cid" xmlns:w16="http://schemas.microsoft.com/office/word/2018/wordml" xmlns:w16sdtdh="http://schemas.microsoft.com/office/word/2020/wordml/sdtdatahash" xmlns:w16se="http://schemas.microsoft.com/office/word/2015/wordml/symex" xmlns:wpg="http://schemas.microsoft.com/office/word/2010/wordprocessingGroup" xmlns:wpi="http://schemas.microsoft.com/office/word/2010/wordprocessingInk" xmlns:wne="http://schemas.microsoft.com/office/word/2006/wordml" xmlns:wps="http://schemas.microsoft.com/office/word/2010/wordprocessingShape" mc:Ignorable="w14 w15 w16se w16cid w16 w16cex w16sdtdh wp14">
   <w:body>
     <w:p>
       <w:pPr>
@@ -344,28 +344,15 @@
         </w:rPr>
         <w:t xml:space="preserve">Link: </w:t>
       </w:r>
-      <w:r>
-        <w:fldChar w:fldCharType="begin"/>
-      </w:r>
-      <w:r>
-        <w:rPr>
-          <w:lang w:val="pt-BR"/>
-        </w:rPr>
-        <w:instrText>HYPERLINK "https://www.kaggle.com/datasets/yasserh/titanic-dataset"</w:instrText>
-      </w:r>
-      <w:r>
-        <w:fldChar w:fldCharType="separate"/>
-      </w:r>
-      <w:r>
-        <w:rPr>
-          <w:rStyle w:val="Hyperlink"/>
-          <w:lang w:val="pt-BR"/>
-        </w:rPr>
-        <w:t>https://www.kaggle.com/datasets/yasserh/titanic-dataset</w:t>
-      </w:r>
-      <w:r>
-        <w:fldChar w:fldCharType="end"/>
-      </w:r>
+      <w:hyperlink r:id="rId7" w:history="1">
+        <w:r>
+          <w:rPr>
+            <w:rStyle w:val="Hyperlink"/>
+            <w:lang w:val="pt-BR"/>
+          </w:rPr>
+          <w:t>https://www.kaggle.com/datasets/yasserh/titanic-dataset</w:t>
+        </w:r>
+      </w:hyperlink>
     </w:p>
     <w:p>
       <w:pPr>
@@ -523,29 +510,16 @@
           <w:lang w:bidi="ar"/>
         </w:rPr>
       </w:pPr>
-      <w:proofErr w:type="spellStart"/>
-      <w:r>
-        <w:rPr>
-          <w:rFonts w:ascii="Consolas" w:eastAsia="Consolas" w:hAnsi="Consolas" w:cs="Consolas"/>
-          <w:color w:val="D4D4D4"/>
-          <w:sz w:val="15"/>
-          <w:szCs w:val="15"/>
-          <w:shd w:val="clear" w:color="auto" w:fill="0B010B"/>
-          <w:lang w:bidi="ar"/>
-        </w:rPr>
-        <w:t>df</w:t>
-      </w:r>
-      <w:proofErr w:type="spellEnd"/>
-      <w:r>
-        <w:rPr>
-          <w:rFonts w:ascii="Consolas" w:eastAsia="Consolas" w:hAnsi="Consolas" w:cs="Consolas"/>
-          <w:color w:val="D4D4D4"/>
-          <w:sz w:val="15"/>
-          <w:szCs w:val="15"/>
-          <w:shd w:val="clear" w:color="auto" w:fill="0B010B"/>
-          <w:lang w:bidi="ar"/>
-        </w:rPr>
-        <w:t xml:space="preserve"> </w:t>
+      <w:r>
+        <w:rPr>
+          <w:rFonts w:ascii="Consolas" w:eastAsia="Consolas" w:hAnsi="Consolas" w:cs="Consolas"/>
+          <w:color w:val="D4D4D4"/>
+          <w:sz w:val="15"/>
+          <w:szCs w:val="15"/>
+          <w:shd w:val="clear" w:color="auto" w:fill="0B010B"/>
+          <w:lang w:bidi="ar"/>
+        </w:rPr>
+        <w:t xml:space="preserve">df </w:t>
       </w:r>
       <w:r>
         <w:rPr>
@@ -709,31 +683,7 @@
           <w:shd w:val="clear" w:color="auto" w:fill="0B010B"/>
           <w:lang w:bidi="ar"/>
         </w:rPr>
-        <w:t xml:space="preserve">"=== </w:t>
-      </w:r>
-      <w:proofErr w:type="gramStart"/>
-      <w:r>
-        <w:rPr>
-          <w:rFonts w:ascii="Consolas" w:eastAsia="Consolas" w:hAnsi="Consolas" w:cs="Consolas"/>
-          <w:color w:val="DAD16F"/>
-          <w:sz w:val="15"/>
-          <w:szCs w:val="15"/>
-          <w:shd w:val="clear" w:color="auto" w:fill="0B010B"/>
-          <w:lang w:bidi="ar"/>
-        </w:rPr>
-        <w:t>HEAD(</w:t>
-      </w:r>
-      <w:proofErr w:type="gramEnd"/>
-      <w:r>
-        <w:rPr>
-          <w:rFonts w:ascii="Consolas" w:eastAsia="Consolas" w:hAnsi="Consolas" w:cs="Consolas"/>
-          <w:color w:val="DAD16F"/>
-          <w:sz w:val="15"/>
-          <w:szCs w:val="15"/>
-          <w:shd w:val="clear" w:color="auto" w:fill="0B010B"/>
-          <w:lang w:bidi="ar"/>
-        </w:rPr>
-        <w:t>) ==="</w:t>
+        <w:t>"=== HEAD() ==="</w:t>
       </w:r>
       <w:r>
         <w:rPr>
@@ -1177,8 +1127,123 @@
           <w:shd w:val="clear" w:color="auto" w:fill="0B010B"/>
           <w:lang w:bidi="ar"/>
         </w:rPr>
+        <w:t>()</w:t>
+      </w:r>
+      <w:r>
+        <w:rPr>
+          <w:rFonts w:ascii="Consolas" w:eastAsia="Consolas" w:hAnsi="Consolas" w:cs="Consolas"/>
+          <w:color w:val="988BC7"/>
+          <w:sz w:val="15"/>
+          <w:szCs w:val="15"/>
+          <w:shd w:val="clear" w:color="auto" w:fill="0B010B"/>
+          <w:lang w:bidi="ar"/>
+        </w:rPr>
+        <w:t>.</w:t>
+      </w:r>
+      <w:r>
+        <w:rPr>
+          <w:rFonts w:ascii="Consolas" w:eastAsia="Consolas" w:hAnsi="Consolas" w:cs="Consolas"/>
+          <w:color w:val="5DD465"/>
+          <w:sz w:val="15"/>
+          <w:szCs w:val="15"/>
+          <w:shd w:val="clear" w:color="auto" w:fill="0B010B"/>
+          <w:lang w:bidi="ar"/>
+        </w:rPr>
+        <w:t>mean</w:t>
+      </w:r>
+      <w:r>
+        <w:rPr>
+          <w:rFonts w:ascii="Consolas" w:eastAsia="Consolas" w:hAnsi="Consolas" w:cs="Consolas"/>
+          <w:color w:val="D4D4D4"/>
+          <w:sz w:val="15"/>
+          <w:szCs w:val="15"/>
+          <w:shd w:val="clear" w:color="auto" w:fill="0B010B"/>
+          <w:lang w:bidi="ar"/>
+        </w:rPr>
+        <w:t xml:space="preserve">() </w:t>
+      </w:r>
+      <w:r>
+        <w:rPr>
+          <w:rFonts w:ascii="Consolas" w:eastAsia="Consolas" w:hAnsi="Consolas" w:cs="Consolas"/>
+          <w:color w:val="FF79AC"/>
+          <w:sz w:val="15"/>
+          <w:szCs w:val="15"/>
+          <w:shd w:val="clear" w:color="auto" w:fill="0B010B"/>
+          <w:lang w:bidi="ar"/>
+        </w:rPr>
+        <w:t>*</w:t>
+      </w:r>
+      <w:r>
+        <w:rPr>
+          <w:rFonts w:ascii="Consolas" w:eastAsia="Consolas" w:hAnsi="Consolas" w:cs="Consolas"/>
+          <w:color w:val="D4D4D4"/>
+          <w:sz w:val="15"/>
+          <w:szCs w:val="15"/>
+          <w:shd w:val="clear" w:color="auto" w:fill="0B010B"/>
+          <w:lang w:bidi="ar"/>
+        </w:rPr>
+        <w:t xml:space="preserve"> </w:t>
+      </w:r>
+      <w:r>
+        <w:rPr>
+          <w:rFonts w:ascii="Consolas" w:eastAsia="Consolas" w:hAnsi="Consolas" w:cs="Consolas"/>
+          <w:color w:val="78D1E1"/>
+          <w:sz w:val="15"/>
+          <w:szCs w:val="15"/>
+          <w:shd w:val="clear" w:color="auto" w:fill="0B010B"/>
+          <w:lang w:bidi="ar"/>
+        </w:rPr>
+        <w:t>100</w:t>
+      </w:r>
+    </w:p>
+    <w:p>
+      <w:pPr>
+        <w:shd w:val="clear" w:color="auto" w:fill="0B010B"/>
+        <w:rPr>
+          <w:rFonts w:ascii="Consolas" w:eastAsia="Consolas" w:hAnsi="Consolas" w:cs="Consolas"/>
+          <w:color w:val="D4D4D4"/>
+          <w:sz w:val="15"/>
+          <w:szCs w:val="15"/>
+          <w:shd w:val="clear" w:color="auto" w:fill="0B010B"/>
+          <w:lang w:bidi="ar"/>
+        </w:rPr>
+      </w:pPr>
+      <w:r>
+        <w:rPr>
+          <w:rFonts w:ascii="Consolas" w:eastAsia="Consolas" w:hAnsi="Consolas" w:cs="Consolas"/>
+          <w:b/>
+          <w:bCs/>
+          <w:color w:val="988BC7"/>
+          <w:sz w:val="15"/>
+          <w:szCs w:val="15"/>
+          <w:shd w:val="clear" w:color="auto" w:fill="0B010B"/>
+          <w:lang w:bidi="ar"/>
+        </w:rPr>
+        <w:t>print</w:t>
+      </w:r>
+      <w:r>
+        <w:rPr>
+          <w:rFonts w:ascii="Consolas" w:eastAsia="Consolas" w:hAnsi="Consolas" w:cs="Consolas"/>
+          <w:color w:val="D4D4D4"/>
+          <w:sz w:val="15"/>
+          <w:szCs w:val="15"/>
+          <w:shd w:val="clear" w:color="auto" w:fill="0B010B"/>
+          <w:lang w:bidi="ar"/>
+        </w:rPr>
         <w:t>(</w:t>
       </w:r>
+      <w:proofErr w:type="spellStart"/>
+      <w:r>
+        <w:rPr>
+          <w:rFonts w:ascii="Consolas" w:eastAsia="Consolas" w:hAnsi="Consolas" w:cs="Consolas"/>
+          <w:color w:val="D4D4D4"/>
+          <w:sz w:val="15"/>
+          <w:szCs w:val="15"/>
+          <w:shd w:val="clear" w:color="auto" w:fill="0B010B"/>
+          <w:lang w:bidi="ar"/>
+        </w:rPr>
+        <w:t>percentual_</w:t>
+      </w:r>
       <w:proofErr w:type="gramStart"/>
       <w:r>
         <w:rPr>
@@ -1189,7 +1254,7 @@
           <w:shd w:val="clear" w:color="auto" w:fill="0B010B"/>
           <w:lang w:bidi="ar"/>
         </w:rPr>
-        <w:t>)</w:t>
+        <w:t>nulos</w:t>
       </w:r>
       <w:r>
         <w:rPr>
@@ -1211,19 +1276,42 @@
           <w:shd w:val="clear" w:color="auto" w:fill="0B010B"/>
           <w:lang w:bidi="ar"/>
         </w:rPr>
-        <w:t>mean</w:t>
+        <w:t>sort</w:t>
       </w:r>
       <w:proofErr w:type="gramEnd"/>
       <w:r>
         <w:rPr>
           <w:rFonts w:ascii="Consolas" w:eastAsia="Consolas" w:hAnsi="Consolas" w:cs="Consolas"/>
-          <w:color w:val="D4D4D4"/>
-          <w:sz w:val="15"/>
-          <w:szCs w:val="15"/>
-          <w:shd w:val="clear" w:color="auto" w:fill="0B010B"/>
-          <w:lang w:bidi="ar"/>
-        </w:rPr>
-        <w:t xml:space="preserve">() </w:t>
+          <w:color w:val="5DD465"/>
+          <w:sz w:val="15"/>
+          <w:szCs w:val="15"/>
+          <w:shd w:val="clear" w:color="auto" w:fill="0B010B"/>
+          <w:lang w:bidi="ar"/>
+        </w:rPr>
+        <w:t>_values</w:t>
+      </w:r>
+      <w:proofErr w:type="spellEnd"/>
+      <w:r>
+        <w:rPr>
+          <w:rFonts w:ascii="Consolas" w:eastAsia="Consolas" w:hAnsi="Consolas" w:cs="Consolas"/>
+          <w:color w:val="D4D4D4"/>
+          <w:sz w:val="15"/>
+          <w:szCs w:val="15"/>
+          <w:shd w:val="clear" w:color="auto" w:fill="0B010B"/>
+          <w:lang w:bidi="ar"/>
+        </w:rPr>
+        <w:t>(</w:t>
+      </w:r>
+      <w:r>
+        <w:rPr>
+          <w:rFonts w:ascii="Consolas" w:eastAsia="Consolas" w:hAnsi="Consolas" w:cs="Consolas"/>
+          <w:color w:val="E89E64"/>
+          <w:sz w:val="15"/>
+          <w:szCs w:val="15"/>
+          <w:shd w:val="clear" w:color="auto" w:fill="0B010B"/>
+          <w:lang w:bidi="ar"/>
+        </w:rPr>
+        <w:t>ascending</w:t>
       </w:r>
       <w:r>
         <w:rPr>
@@ -1234,18 +1322,7 @@
           <w:shd w:val="clear" w:color="auto" w:fill="0B010B"/>
           <w:lang w:bidi="ar"/>
         </w:rPr>
-        <w:t>*</w:t>
-      </w:r>
-      <w:r>
-        <w:rPr>
-          <w:rFonts w:ascii="Consolas" w:eastAsia="Consolas" w:hAnsi="Consolas" w:cs="Consolas"/>
-          <w:color w:val="D4D4D4"/>
-          <w:sz w:val="15"/>
-          <w:szCs w:val="15"/>
-          <w:shd w:val="clear" w:color="auto" w:fill="0B010B"/>
-          <w:lang w:bidi="ar"/>
-        </w:rPr>
-        <w:t xml:space="preserve"> </w:t>
+        <w:t>=</w:t>
       </w:r>
       <w:r>
         <w:rPr>
@@ -1256,7 +1333,18 @@
           <w:shd w:val="clear" w:color="auto" w:fill="0B010B"/>
           <w:lang w:bidi="ar"/>
         </w:rPr>
-        <w:t>100</w:t>
+        <w:t>False</w:t>
+      </w:r>
+      <w:r>
+        <w:rPr>
+          <w:rFonts w:ascii="Consolas" w:eastAsia="Consolas" w:hAnsi="Consolas" w:cs="Consolas"/>
+          <w:color w:val="D4D4D4"/>
+          <w:sz w:val="15"/>
+          <w:szCs w:val="15"/>
+          <w:shd w:val="clear" w:color="auto" w:fill="0B010B"/>
+          <w:lang w:bidi="ar"/>
+        </w:rPr>
+        <w:t>))</w:t>
       </w:r>
     </w:p>
     <w:p>
@@ -1271,144 +1359,6 @@
           <w:lang w:bidi="ar"/>
         </w:rPr>
       </w:pPr>
-      <w:r>
-        <w:rPr>
-          <w:rFonts w:ascii="Consolas" w:eastAsia="Consolas" w:hAnsi="Consolas" w:cs="Consolas"/>
-          <w:b/>
-          <w:bCs/>
-          <w:color w:val="988BC7"/>
-          <w:sz w:val="15"/>
-          <w:szCs w:val="15"/>
-          <w:shd w:val="clear" w:color="auto" w:fill="0B010B"/>
-          <w:lang w:bidi="ar"/>
-        </w:rPr>
-        <w:t>print</w:t>
-      </w:r>
-      <w:r>
-        <w:rPr>
-          <w:rFonts w:ascii="Consolas" w:eastAsia="Consolas" w:hAnsi="Consolas" w:cs="Consolas"/>
-          <w:color w:val="D4D4D4"/>
-          <w:sz w:val="15"/>
-          <w:szCs w:val="15"/>
-          <w:shd w:val="clear" w:color="auto" w:fill="0B010B"/>
-          <w:lang w:bidi="ar"/>
-        </w:rPr>
-        <w:t>(</w:t>
-      </w:r>
-      <w:proofErr w:type="spellStart"/>
-      <w:r>
-        <w:rPr>
-          <w:rFonts w:ascii="Consolas" w:eastAsia="Consolas" w:hAnsi="Consolas" w:cs="Consolas"/>
-          <w:color w:val="D4D4D4"/>
-          <w:sz w:val="15"/>
-          <w:szCs w:val="15"/>
-          <w:shd w:val="clear" w:color="auto" w:fill="0B010B"/>
-          <w:lang w:bidi="ar"/>
-        </w:rPr>
-        <w:t>percentual_</w:t>
-      </w:r>
-      <w:proofErr w:type="gramStart"/>
-      <w:r>
-        <w:rPr>
-          <w:rFonts w:ascii="Consolas" w:eastAsia="Consolas" w:hAnsi="Consolas" w:cs="Consolas"/>
-          <w:color w:val="D4D4D4"/>
-          <w:sz w:val="15"/>
-          <w:szCs w:val="15"/>
-          <w:shd w:val="clear" w:color="auto" w:fill="0B010B"/>
-          <w:lang w:bidi="ar"/>
-        </w:rPr>
-        <w:t>nulos</w:t>
-      </w:r>
-      <w:r>
-        <w:rPr>
-          <w:rFonts w:ascii="Consolas" w:eastAsia="Consolas" w:hAnsi="Consolas" w:cs="Consolas"/>
-          <w:color w:val="988BC7"/>
-          <w:sz w:val="15"/>
-          <w:szCs w:val="15"/>
-          <w:shd w:val="clear" w:color="auto" w:fill="0B010B"/>
-          <w:lang w:bidi="ar"/>
-        </w:rPr>
-        <w:t>.</w:t>
-      </w:r>
-      <w:r>
-        <w:rPr>
-          <w:rFonts w:ascii="Consolas" w:eastAsia="Consolas" w:hAnsi="Consolas" w:cs="Consolas"/>
-          <w:color w:val="5DD465"/>
-          <w:sz w:val="15"/>
-          <w:szCs w:val="15"/>
-          <w:shd w:val="clear" w:color="auto" w:fill="0B010B"/>
-          <w:lang w:bidi="ar"/>
-        </w:rPr>
-        <w:t>sort</w:t>
-      </w:r>
-      <w:proofErr w:type="gramEnd"/>
-      <w:r>
-        <w:rPr>
-          <w:rFonts w:ascii="Consolas" w:eastAsia="Consolas" w:hAnsi="Consolas" w:cs="Consolas"/>
-          <w:color w:val="5DD465"/>
-          <w:sz w:val="15"/>
-          <w:szCs w:val="15"/>
-          <w:shd w:val="clear" w:color="auto" w:fill="0B010B"/>
-          <w:lang w:bidi="ar"/>
-        </w:rPr>
-        <w:t>_values</w:t>
-      </w:r>
-      <w:proofErr w:type="spellEnd"/>
-      <w:r>
-        <w:rPr>
-          <w:rFonts w:ascii="Consolas" w:eastAsia="Consolas" w:hAnsi="Consolas" w:cs="Consolas"/>
-          <w:color w:val="D4D4D4"/>
-          <w:sz w:val="15"/>
-          <w:szCs w:val="15"/>
-          <w:shd w:val="clear" w:color="auto" w:fill="0B010B"/>
-          <w:lang w:bidi="ar"/>
-        </w:rPr>
-        <w:t>(</w:t>
-      </w:r>
-      <w:r>
-        <w:rPr>
-          <w:rFonts w:ascii="Consolas" w:eastAsia="Consolas" w:hAnsi="Consolas" w:cs="Consolas"/>
-          <w:color w:val="E89E64"/>
-          <w:sz w:val="15"/>
-          <w:szCs w:val="15"/>
-          <w:shd w:val="clear" w:color="auto" w:fill="0B010B"/>
-          <w:lang w:bidi="ar"/>
-        </w:rPr>
-        <w:t>ascending</w:t>
-      </w:r>
-      <w:r>
-        <w:rPr>
-          <w:rFonts w:ascii="Consolas" w:eastAsia="Consolas" w:hAnsi="Consolas" w:cs="Consolas"/>
-          <w:color w:val="FF79AC"/>
-          <w:sz w:val="15"/>
-          <w:szCs w:val="15"/>
-          <w:shd w:val="clear" w:color="auto" w:fill="0B010B"/>
-          <w:lang w:bidi="ar"/>
-        </w:rPr>
-        <w:t>=</w:t>
-      </w:r>
-      <w:r>
-        <w:rPr>
-          <w:rFonts w:ascii="Consolas" w:eastAsia="Consolas" w:hAnsi="Consolas" w:cs="Consolas"/>
-          <w:color w:val="78D1E1"/>
-          <w:sz w:val="15"/>
-          <w:szCs w:val="15"/>
-          <w:shd w:val="clear" w:color="auto" w:fill="0B010B"/>
-          <w:lang w:bidi="ar"/>
-        </w:rPr>
-        <w:t>False</w:t>
-      </w:r>
-      <w:r>
-        <w:rPr>
-          <w:rFonts w:ascii="Consolas" w:eastAsia="Consolas" w:hAnsi="Consolas" w:cs="Consolas"/>
-          <w:color w:val="D4D4D4"/>
-          <w:sz w:val="15"/>
-          <w:szCs w:val="15"/>
-          <w:shd w:val="clear" w:color="auto" w:fill="0B010B"/>
-          <w:lang w:bidi="ar"/>
-        </w:rPr>
-        <w:t>))</w:t>
-      </w:r>
     </w:p>
     <w:p>
       <w:pPr>
@@ -1418,44 +1368,18 @@
           <w:color w:val="D4D4D4"/>
           <w:sz w:val="15"/>
           <w:szCs w:val="15"/>
-          <w:shd w:val="clear" w:color="auto" w:fill="0B010B"/>
-          <w:lang w:bidi="ar"/>
-        </w:rPr>
-      </w:pPr>
-    </w:p>
-    <w:p>
-      <w:pPr>
-        <w:shd w:val="clear" w:color="auto" w:fill="0B010B"/>
-        <w:rPr>
-          <w:rFonts w:ascii="Consolas" w:eastAsia="Consolas" w:hAnsi="Consolas" w:cs="Consolas"/>
-          <w:color w:val="D4D4D4"/>
-          <w:sz w:val="15"/>
-          <w:szCs w:val="15"/>
-        </w:rPr>
-      </w:pPr>
-      <w:proofErr w:type="spellStart"/>
-      <w:r>
-        <w:rPr>
-          <w:rFonts w:ascii="Consolas" w:eastAsia="Consolas" w:hAnsi="Consolas" w:cs="Consolas"/>
-          <w:color w:val="D4D4D4"/>
-          <w:sz w:val="15"/>
-          <w:szCs w:val="15"/>
-          <w:shd w:val="clear" w:color="auto" w:fill="0B010B"/>
-          <w:lang w:bidi="ar"/>
-        </w:rPr>
-        <w:t>df</w:t>
-      </w:r>
-      <w:proofErr w:type="spellEnd"/>
-      <w:r>
-        <w:rPr>
-          <w:rFonts w:ascii="Consolas" w:eastAsia="Consolas" w:hAnsi="Consolas" w:cs="Consolas"/>
-          <w:color w:val="D4D4D4"/>
-          <w:sz w:val="15"/>
-          <w:szCs w:val="15"/>
-          <w:shd w:val="clear" w:color="auto" w:fill="0B010B"/>
-          <w:lang w:bidi="ar"/>
-        </w:rPr>
-        <w:t xml:space="preserve"> </w:t>
+        </w:rPr>
+      </w:pPr>
+      <w:r>
+        <w:rPr>
+          <w:rFonts w:ascii="Consolas" w:eastAsia="Consolas" w:hAnsi="Consolas" w:cs="Consolas"/>
+          <w:color w:val="D4D4D4"/>
+          <w:sz w:val="15"/>
+          <w:szCs w:val="15"/>
+          <w:shd w:val="clear" w:color="auto" w:fill="0B010B"/>
+          <w:lang w:bidi="ar"/>
+        </w:rPr>
+        <w:t xml:space="preserve">df </w:t>
       </w:r>
       <w:r>
         <w:rPr>
@@ -1524,19 +1448,7 @@
           <w:shd w:val="clear" w:color="auto" w:fill="0B010B"/>
           <w:lang w:bidi="ar"/>
         </w:rPr>
-        <w:t>_</w:t>
-      </w:r>
-      <w:proofErr w:type="gramStart"/>
-      <w:r>
-        <w:rPr>
-          <w:rFonts w:ascii="Consolas" w:eastAsia="Consolas" w:hAnsi="Consolas" w:cs="Consolas"/>
-          <w:color w:val="5DD465"/>
-          <w:sz w:val="15"/>
-          <w:szCs w:val="15"/>
-          <w:shd w:val="clear" w:color="auto" w:fill="0B010B"/>
-          <w:lang w:bidi="ar"/>
-        </w:rPr>
-        <w:t>duplicates</w:t>
+        <w:t>_duplicates</w:t>
       </w:r>
       <w:proofErr w:type="spellEnd"/>
       <w:r>
@@ -1548,19 +1460,7 @@
           <w:shd w:val="clear" w:color="auto" w:fill="0B010B"/>
           <w:lang w:bidi="ar"/>
         </w:rPr>
-        <w:t>(</w:t>
-      </w:r>
-      <w:proofErr w:type="gramEnd"/>
-      <w:r>
-        <w:rPr>
-          <w:rFonts w:ascii="Consolas" w:eastAsia="Consolas" w:hAnsi="Consolas" w:cs="Consolas"/>
-          <w:color w:val="D4D4D4"/>
-          <w:sz w:val="15"/>
-          <w:szCs w:val="15"/>
-          <w:shd w:val="clear" w:color="auto" w:fill="0B010B"/>
-          <w:lang w:bidi="ar"/>
-        </w:rPr>
-        <w:t>)</w:t>
+        <w:t>()</w:t>
       </w:r>
     </w:p>
     <w:p>
@@ -1573,29 +1473,16 @@
           <w:szCs w:val="15"/>
         </w:rPr>
       </w:pPr>
-      <w:proofErr w:type="spellStart"/>
-      <w:r>
-        <w:rPr>
-          <w:rFonts w:ascii="Consolas" w:eastAsia="Consolas" w:hAnsi="Consolas" w:cs="Consolas"/>
-          <w:color w:val="D4D4D4"/>
-          <w:sz w:val="15"/>
-          <w:szCs w:val="15"/>
-          <w:shd w:val="clear" w:color="auto" w:fill="0B010B"/>
-          <w:lang w:bidi="ar"/>
-        </w:rPr>
-        <w:t>df</w:t>
-      </w:r>
-      <w:proofErr w:type="spellEnd"/>
-      <w:r>
-        <w:rPr>
-          <w:rFonts w:ascii="Consolas" w:eastAsia="Consolas" w:hAnsi="Consolas" w:cs="Consolas"/>
-          <w:color w:val="D4D4D4"/>
-          <w:sz w:val="15"/>
-          <w:szCs w:val="15"/>
-          <w:shd w:val="clear" w:color="auto" w:fill="0B010B"/>
-          <w:lang w:bidi="ar"/>
-        </w:rPr>
-        <w:t xml:space="preserve"> </w:t>
+      <w:r>
+        <w:rPr>
+          <w:rFonts w:ascii="Consolas" w:eastAsia="Consolas" w:hAnsi="Consolas" w:cs="Consolas"/>
+          <w:color w:val="D4D4D4"/>
+          <w:sz w:val="15"/>
+          <w:szCs w:val="15"/>
+          <w:shd w:val="clear" w:color="auto" w:fill="0B010B"/>
+          <w:lang w:bidi="ar"/>
+        </w:rPr>
+        <w:t xml:space="preserve">df </w:t>
       </w:r>
       <w:r>
         <w:rPr>
@@ -1801,29 +1688,16 @@
           <w:lang w:bidi="ar"/>
         </w:rPr>
       </w:pPr>
-      <w:proofErr w:type="spellStart"/>
-      <w:r>
-        <w:rPr>
-          <w:rFonts w:ascii="Consolas" w:eastAsia="Consolas" w:hAnsi="Consolas" w:cs="Consolas"/>
-          <w:color w:val="D4D4D4"/>
-          <w:sz w:val="15"/>
-          <w:szCs w:val="15"/>
-          <w:shd w:val="clear" w:color="auto" w:fill="0B010B"/>
-          <w:lang w:bidi="ar"/>
-        </w:rPr>
-        <w:t>df</w:t>
-      </w:r>
-      <w:proofErr w:type="spellEnd"/>
-      <w:r>
-        <w:rPr>
-          <w:rFonts w:ascii="Consolas" w:eastAsia="Consolas" w:hAnsi="Consolas" w:cs="Consolas"/>
-          <w:color w:val="D4D4D4"/>
-          <w:sz w:val="15"/>
-          <w:szCs w:val="15"/>
-          <w:shd w:val="clear" w:color="auto" w:fill="0B010B"/>
-          <w:lang w:bidi="ar"/>
-        </w:rPr>
-        <w:t xml:space="preserve"> </w:t>
+      <w:r>
+        <w:rPr>
+          <w:rFonts w:ascii="Consolas" w:eastAsia="Consolas" w:hAnsi="Consolas" w:cs="Consolas"/>
+          <w:color w:val="D4D4D4"/>
+          <w:sz w:val="15"/>
+          <w:szCs w:val="15"/>
+          <w:shd w:val="clear" w:color="auto" w:fill="0B010B"/>
+          <w:lang w:bidi="ar"/>
+        </w:rPr>
+        <w:t xml:space="preserve">df </w:t>
       </w:r>
       <w:r>
         <w:rPr>
@@ -1906,7 +1780,6 @@
         </w:rPr>
         <w:t>subset</w:t>
       </w:r>
-      <w:proofErr w:type="gramStart"/>
       <w:r>
         <w:rPr>
           <w:rFonts w:ascii="Consolas" w:eastAsia="Consolas" w:hAnsi="Consolas" w:cs="Consolas"/>
@@ -1929,7 +1802,6 @@
         </w:rPr>
         <w:t>[</w:t>
       </w:r>
-      <w:proofErr w:type="gramEnd"/>
       <w:r>
         <w:rPr>
           <w:rFonts w:ascii="Consolas" w:eastAsia="Consolas" w:hAnsi="Consolas" w:cs="Consolas"/>
@@ -2683,7 +2555,41 @@
           <w:rFonts w:ascii="Arial" w:hAnsi="Arial" w:cs="Arial"/>
           <w:lang w:val="pt-BR"/>
         </w:rPr>
-        <w:t>A análise mostrou que Cabin tinha 77,10% de dados ausentes, Age 19,87% e Embarked 0,22%. Por isso, a coluna Cabin foi removida e as linhas com nulos em Age e Embarked foram excluídas. Após a limpeza, a base ficou com 712 linhas e 11 colunas, sem valores ausentes nas variáveis restantes.</w:t>
+        <w:drawing>
+          <wp:inline distT="0" distB="0" distL="0" distR="0" wp14:anchorId="3AA17821" wp14:editId="5A22A21C">
+            <wp:extent cx="5274310" cy="3395345"/>
+            <wp:effectExtent l="0" t="0" r="2540" b="0"/>
+            <wp:docPr id="2" name="Picture 2"/>
+            <wp:cNvGraphicFramePr>
+              <a:graphicFrameLocks xmlns:a="http://schemas.openxmlformats.org/drawingml/2006/main" noChangeAspect="1"/>
+            </wp:cNvGraphicFramePr>
+            <a:graphic xmlns:a="http://schemas.openxmlformats.org/drawingml/2006/main">
+              <a:graphicData uri="http://schemas.openxmlformats.org/drawingml/2006/picture">
+                <pic:pic xmlns:pic="http://schemas.openxmlformats.org/drawingml/2006/picture">
+                  <pic:nvPicPr>
+                    <pic:cNvPr id="1" name=""/>
+                    <pic:cNvPicPr/>
+                  </pic:nvPicPr>
+                  <pic:blipFill>
+                    <a:blip r:embed="rId8"/>
+                    <a:stretch>
+                      <a:fillRect/>
+                    </a:stretch>
+                  </pic:blipFill>
+                  <pic:spPr>
+                    <a:xfrm>
+                      <a:off x="0" y="0"/>
+                      <a:ext cx="5274310" cy="3395345"/>
+                    </a:xfrm>
+                    <a:prstGeom prst="rect">
+                      <a:avLst/>
+                    </a:prstGeom>
+                  </pic:spPr>
+                </pic:pic>
+              </a:graphicData>
+            </a:graphic>
+          </wp:inline>
+        </w:drawing>
       </w:r>
     </w:p>
     <w:p>
@@ -2695,6 +2601,84 @@
           <w:lang w:val="pt-BR"/>
         </w:rPr>
       </w:pPr>
+    </w:p>
+    <w:p>
+      <w:pPr>
+        <w:spacing w:line="276" w:lineRule="auto"/>
+        <w:jc w:val="both"/>
+        <w:rPr>
+          <w:rFonts w:ascii="Arial" w:hAnsi="Arial" w:cs="Arial"/>
+          <w:lang w:val="pt-BR"/>
+        </w:rPr>
+      </w:pPr>
+      <w:r>
+        <w:rPr>
+          <w:rFonts w:ascii="Arial" w:hAnsi="Arial" w:cs="Arial"/>
+          <w:lang w:val="pt-BR"/>
+        </w:rPr>
+        <w:drawing>
+          <wp:anchor distT="0" distB="0" distL="114300" distR="114300" simplePos="0" relativeHeight="251662336" behindDoc="0" locked="0" layoutInCell="1" allowOverlap="1" wp14:anchorId="22A71EE1" wp14:editId="0085A05F">
+            <wp:simplePos x="0" y="0"/>
+            <wp:positionH relativeFrom="column">
+              <wp:posOffset>0</wp:posOffset>
+            </wp:positionH>
+            <wp:positionV relativeFrom="paragraph">
+              <wp:posOffset>-2540</wp:posOffset>
+            </wp:positionV>
+            <wp:extent cx="5274310" cy="2263140"/>
+            <wp:effectExtent l="0" t="0" r="2540" b="3810"/>
+            <wp:wrapSquare wrapText="bothSides"/>
+            <wp:docPr id="1" name="Picture 1"/>
+            <wp:cNvGraphicFramePr>
+              <a:graphicFrameLocks xmlns:a="http://schemas.openxmlformats.org/drawingml/2006/main" noChangeAspect="1"/>
+            </wp:cNvGraphicFramePr>
+            <a:graphic xmlns:a="http://schemas.openxmlformats.org/drawingml/2006/main">
+              <a:graphicData uri="http://schemas.openxmlformats.org/drawingml/2006/picture">
+                <pic:pic xmlns:pic="http://schemas.openxmlformats.org/drawingml/2006/picture">
+                  <pic:nvPicPr>
+                    <pic:cNvPr id="1" name=""/>
+                    <pic:cNvPicPr/>
+                  </pic:nvPicPr>
+                  <pic:blipFill>
+                    <a:blip r:embed="rId9" cstate="print">
+                      <a:extLst>
+                        <a:ext uri="{28A0092B-C50C-407E-A947-70E740481C1C}">
+                          <a14:useLocalDpi xmlns:a14="http://schemas.microsoft.com/office/drawing/2010/main" val="0"/>
+                        </a:ext>
+                      </a:extLst>
+                    </a:blip>
+                    <a:stretch>
+                      <a:fillRect/>
+                    </a:stretch>
+                  </pic:blipFill>
+                  <pic:spPr>
+                    <a:xfrm>
+                      <a:off x="0" y="0"/>
+                      <a:ext cx="5274310" cy="2263140"/>
+                    </a:xfrm>
+                    <a:prstGeom prst="rect">
+                      <a:avLst/>
+                    </a:prstGeom>
+                  </pic:spPr>
+                </pic:pic>
+              </a:graphicData>
+            </a:graphic>
+            <wp14:sizeRelH relativeFrom="margin">
+              <wp14:pctWidth>0</wp14:pctWidth>
+            </wp14:sizeRelH>
+            <wp14:sizeRelV relativeFrom="margin">
+              <wp14:pctHeight>0</wp14:pctHeight>
+            </wp14:sizeRelV>
+          </wp:anchor>
+        </w:drawing>
+      </w:r>
+      <w:r>
+        <w:rPr>
+          <w:rFonts w:ascii="Arial" w:hAnsi="Arial" w:cs="Arial"/>
+          <w:lang w:val="pt-BR"/>
+        </w:rPr>
+        <w:t>A análise mostrou que Cabin tinha 77,10% de dados ausentes, Age 19,87% e Embarked 0,22%. Por isso, a coluna Cabin foi removida e as linhas com nulos em Age e Embarked foram excluídas. Após a limpeza, a base ficou com 712 linhas e 11 colunas, sem valores ausentes nas variáveis restantes.</w:t>
+      </w:r>
     </w:p>
     <w:p>
       <w:pPr>
@@ -3087,6 +3071,7 @@
           <w:shd w:val="clear" w:color="auto" w:fill="0B010B"/>
           <w:lang w:val="pt-BR" w:bidi="ar"/>
         </w:rPr>
+        <w:lastRenderedPageBreak/>
         <w:t>Mediana: 15.646</w:t>
       </w:r>
     </w:p>
@@ -3590,7 +3575,6 @@
         <w:rPr>
           <w:noProof/>
         </w:rPr>
-        <w:lastRenderedPageBreak/>
         <w:drawing>
           <wp:inline distT="0" distB="0" distL="114300" distR="114300" wp14:anchorId="0FE43FB2" wp14:editId="0FE43FB3">
             <wp:extent cx="3832225" cy="2727960"/>
@@ -3609,7 +3593,7 @@
                     </pic:cNvPicPr>
                   </pic:nvPicPr>
                   <pic:blipFill>
-                    <a:blip r:embed="rId7"/>
+                    <a:blip r:embed="rId10"/>
                     <a:stretch>
                       <a:fillRect/>
                     </a:stretch>
@@ -3702,7 +3686,7 @@
           </mc:Choice>
           <mc:Fallback>
             <w:pict>
-              <v:line w14:anchorId="3F42E3A9" id="Conector Reto 3" o:spid="_x0000_s1026" style="position:absolute;z-index:251659264;visibility:visible;mso-wrap-style:square;mso-wrap-distance-left:9pt;mso-wrap-distance-top:0;mso-wrap-distance-right:9pt;mso-wrap-distance-bottom:0;mso-position-horizontal:absolute;mso-position-horizontal-relative:text;mso-position-vertical:absolute;mso-position-vertical-relative:text" from="-.65pt,3.9pt" to="402.3pt,3.9pt" o:gfxdata="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" strokecolor="black [3213]" strokeweight="1pt">
+              <v:line w14:anchorId="3B289CB9" id="Conector Reto 3" o:spid="_x0000_s1026" style="position:absolute;z-index:251659264;visibility:visible;mso-wrap-style:square;mso-wrap-distance-left:9pt;mso-wrap-distance-top:0;mso-wrap-distance-right:9pt;mso-wrap-distance-bottom:0;mso-position-horizontal:absolute;mso-position-horizontal-relative:text;mso-position-vertical:absolute;mso-position-vertical-relative:text" from="-.65pt,3.9pt" to="402.3pt,3.9pt" o:gfxdata="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" strokecolor="black [3213]" strokeweight="1pt">
                 <v:stroke joinstyle="miter"/>
               </v:line>
             </w:pict>
@@ -3728,6 +3712,7 @@
           <w:bCs/>
           <w:lang w:val="pt-BR"/>
         </w:rPr>
+        <w:lastRenderedPageBreak/>
         <w:t>Histograma de Fare</w:t>
       </w:r>
     </w:p>
@@ -3943,7 +3928,7 @@
                     </pic:cNvPicPr>
                   </pic:nvPicPr>
                   <pic:blipFill>
-                    <a:blip r:embed="rId8"/>
+                    <a:blip r:embed="rId11"/>
                     <a:stretch>
                       <a:fillRect/>
                     </a:stretch>
@@ -4046,7 +4031,7 @@
                     </pic:cNvPicPr>
                   </pic:nvPicPr>
                   <pic:blipFill>
-                    <a:blip r:embed="rId9"/>
+                    <a:blip r:embed="rId12"/>
                     <a:stretch>
                       <a:fillRect/>
                     </a:stretch>
@@ -4085,6 +4070,7 @@
           <w:rFonts w:ascii="Arial" w:hAnsi="Arial" w:cs="Arial"/>
           <w:lang w:val="pt-BR"/>
         </w:rPr>
+        <w:lastRenderedPageBreak/>
         <w:t>O gráfico mostra uma correlação positiva fraca a moderada entre SibSp e Parch (0,383). A maior parte dos pontos está em (0,0), o que indica que muitos passageiros estavam viajando sozinhos. Os outros pontos aparecem mais espalhados, mostrando que existe alguma relação entre as variáveis, mas não é uma relação muito forte.</w:t>
       </w:r>
     </w:p>
@@ -4157,7 +4143,7 @@
                     </pic:cNvPicPr>
                   </pic:nvPicPr>
                   <pic:blipFill>
-                    <a:blip r:embed="rId10"/>
+                    <a:blip r:embed="rId13"/>
                     <a:stretch>
                       <a:fillRect/>
                     </a:stretch>
@@ -4208,7 +4194,7 @@
                     </pic:cNvPicPr>
                   </pic:nvPicPr>
                   <pic:blipFill>
-                    <a:blip r:embed="rId11"/>
+                    <a:blip r:embed="rId14"/>
                     <a:stretch>
                       <a:fillRect/>
                     </a:stretch>
@@ -4247,7 +4233,6 @@
           <w:rFonts w:ascii="Arial" w:hAnsi="Arial" w:cs="Arial"/>
           <w:lang w:val="pt-BR"/>
         </w:rPr>
-        <w:lastRenderedPageBreak/>
         <w:t>Nesse caso, os outliers em Fare não parecem ser erro, mas sim casos raros que realmente aconteceram. O boxplot antes da remoção mostra várias tarifas bem acima da maioria, e depois da remoção os valores ficam mais concentrados. Isso mostra que esses valores muito altos acabavam distorcendo a visualização.</w:t>
       </w:r>
     </w:p>
@@ -4389,7 +4374,7 @@
         </w:rPr>
         <w:t xml:space="preserve">Link do Github caso queira ver o código completo: </w:t>
       </w:r>
-      <w:hyperlink r:id="rId12" w:history="1">
+      <w:hyperlink r:id="rId15" w:history="1">
         <w:r>
           <w:rPr>
             <w:rFonts w:ascii="Arial" w:hAnsi="Arial" w:cs="Arial"/>
@@ -4417,7 +4402,7 @@
 </file>
 
 <file path=word/numbering.xml><?xml version="1.0" encoding="utf-8"?>
-<w:numbering xmlns:wpc="http://schemas.microsoft.com/office/word/2010/wordprocessingCanvas" xmlns:cx="http://schemas.microsoft.com/office/drawing/2014/chartex" xmlns:cx1="http://schemas.microsoft.com/office/drawing/2015/9/8/chartex" xmlns:cx2="http://schemas.microsoft.com/office/drawing/2015/10/21/chartex" xmlns:cx3="http://schemas.microsoft.com/office/drawing/2016/5/9/chartex" xmlns:cx4="http://schemas.microsoft.com/office/drawing/2016/5/10/chartex" xmlns:cx5="http://schemas.microsoft.com/office/drawing/2016/5/11/chartex" xmlns:cx6="http://schemas.microsoft.com/office/drawing/2016/5/12/chartex" xmlns:cx7="http://schemas.microsoft.com/office/drawing/2016/5/13/chartex" xmlns:cx8="http://schemas.microsoft.com/office/drawing/2016/5/14/chartex" xmlns:mc="http://schemas.openxmlformats.org/markup-compatibility/2006" xmlns:aink="http://schemas.microsoft.com/office/drawing/2016/ink" xmlns:am3d="http://schemas.microsoft.com/office/drawing/2017/model3d" xmlns:o="urn:schemas-microsoft-com:office:office" xmlns:oel="http://schemas.microsoft.com/office/2019/extlst" xmlns:r="http://schemas.openxmlformats.org/officeDocument/2006/relationships" xmlns:m="http://schemas.openxmlformats.org/officeDocument/2006/math" xmlns:v="urn:schemas-microsoft-com:vml" xmlns:wp14="http://schemas.microsoft.com/office/word/2010/wordprocessingDrawing" xmlns:wp="http://schemas.openxmlformats.org/drawingml/2006/wordprocessingDrawing" xmlns:w10="urn:schemas-microsoft-com:office:word" xmlns:w="http://schemas.openxmlformats.org/wordprocessingml/2006/main" xmlns:w14="http://schemas.microsoft.com/office/word/2010/wordml" xmlns:w15="http://schemas.microsoft.com/office/word/2012/wordml" xmlns:w16cex="http://schemas.microsoft.com/office/word/2018/wordml/cex" xmlns:w16cid="http://schemas.microsoft.com/office/word/2016/wordml/cid" xmlns:w16="http://schemas.microsoft.com/office/word/2018/wordml" xmlns:w16du="http://schemas.microsoft.com/office/word/2023/wordml/word16du" xmlns:w16sdtdh="http://schemas.microsoft.com/office/word/2020/wordml/sdtdatahash" xmlns:w16sdtfl="http://schemas.microsoft.com/office/word/2024/wordml/sdtformatlock" xmlns:w16se="http://schemas.microsoft.com/office/word/2015/wordml/symex" xmlns:wpg="http://schemas.microsoft.com/office/word/2010/wordprocessingGroup" xmlns:wpi="http://schemas.microsoft.com/office/word/2010/wordprocessingInk" xmlns:wne="http://schemas.microsoft.com/office/word/2006/wordml" xmlns:wps="http://schemas.microsoft.com/office/word/2010/wordprocessingShape" mc:Ignorable="w14 w15 w16se w16cid w16 w16cex w16sdtdh w16sdtfl w16du wp14">
+<w:numbering xmlns:wpc="http://schemas.microsoft.com/office/word/2010/wordprocessingCanvas" xmlns:cx="http://schemas.microsoft.com/office/drawing/2014/chartex" xmlns:cx1="http://schemas.microsoft.com/office/drawing/2015/9/8/chartex" xmlns:cx2="http://schemas.microsoft.com/office/drawing/2015/10/21/chartex" xmlns:cx3="http://schemas.microsoft.com/office/drawing/2016/5/9/chartex" xmlns:cx4="http://schemas.microsoft.com/office/drawing/2016/5/10/chartex" xmlns:cx5="http://schemas.microsoft.com/office/drawing/2016/5/11/chartex" xmlns:cx6="http://schemas.microsoft.com/office/drawing/2016/5/12/chartex" xmlns:cx7="http://schemas.microsoft.com/office/drawing/2016/5/13/chartex" xmlns:cx8="http://schemas.microsoft.com/office/drawing/2016/5/14/chartex" xmlns:mc="http://schemas.openxmlformats.org/markup-compatibility/2006" xmlns:aink="http://schemas.microsoft.com/office/drawing/2016/ink" xmlns:am3d="http://schemas.microsoft.com/office/drawing/2017/model3d" xmlns:o="urn:schemas-microsoft-com:office:office" xmlns:r="http://schemas.openxmlformats.org/officeDocument/2006/relationships" xmlns:m="http://schemas.openxmlformats.org/officeDocument/2006/math" xmlns:v="urn:schemas-microsoft-com:vml" xmlns:wp14="http://schemas.microsoft.com/office/word/2010/wordprocessingDrawing" xmlns:wp="http://schemas.openxmlformats.org/drawingml/2006/wordprocessingDrawing" xmlns:w10="urn:schemas-microsoft-com:office:word" xmlns:w="http://schemas.openxmlformats.org/wordprocessingml/2006/main" xmlns:w14="http://schemas.microsoft.com/office/word/2010/wordml" xmlns:w15="http://schemas.microsoft.com/office/word/2012/wordml" xmlns:w16cex="http://schemas.microsoft.com/office/word/2018/wordml/cex" xmlns:w16cid="http://schemas.microsoft.com/office/word/2016/wordml/cid" xmlns:w16="http://schemas.microsoft.com/office/word/2018/wordml" xmlns:w16sdtdh="http://schemas.microsoft.com/office/word/2020/wordml/sdtdatahash" xmlns:w16se="http://schemas.microsoft.com/office/word/2015/wordml/symex" xmlns:wpg="http://schemas.microsoft.com/office/word/2010/wordprocessingGroup" xmlns:wpi="http://schemas.microsoft.com/office/word/2010/wordprocessingInk" xmlns:wne="http://schemas.microsoft.com/office/word/2006/wordml" xmlns:wps="http://schemas.microsoft.com/office/word/2010/wordprocessingShape" mc:Ignorable="w14 w15 w16se w16cid w16 w16cex w16sdtdh wp14">
   <w:abstractNum w:abstractNumId="0" w15:restartNumberingAfterBreak="0">
     <w:nsid w:val="9356C93C"/>
     <w:multiLevelType w:val="singleLevel"/>
@@ -4899,29 +4884,29 @@
       </w:pPr>
     </w:lvl>
   </w:abstractNum>
-  <w:num w:numId="1" w16cid:durableId="1345741447">
+  <w:num w:numId="1">
     <w:abstractNumId w:val="0"/>
   </w:num>
-  <w:num w:numId="2" w16cid:durableId="389307308">
+  <w:num w:numId="2">
     <w:abstractNumId w:val="2"/>
   </w:num>
-  <w:num w:numId="3" w16cid:durableId="251014278">
+  <w:num w:numId="3">
     <w:abstractNumId w:val="5"/>
   </w:num>
-  <w:num w:numId="4" w16cid:durableId="30494641">
+  <w:num w:numId="4">
     <w:abstractNumId w:val="1"/>
   </w:num>
-  <w:num w:numId="5" w16cid:durableId="1752970415">
+  <w:num w:numId="5">
     <w:abstractNumId w:val="3"/>
   </w:num>
-  <w:num w:numId="6" w16cid:durableId="1879127169">
+  <w:num w:numId="6">
     <w:abstractNumId w:val="4"/>
   </w:num>
 </w:numbering>
 </file>
 
 <file path=word/styles.xml><?xml version="1.0" encoding="utf-8"?>
-<w:styles xmlns:mc="http://schemas.openxmlformats.org/markup-compatibility/2006" xmlns:r="http://schemas.openxmlformats.org/officeDocument/2006/relationships" xmlns:w="http://schemas.openxmlformats.org/wordprocessingml/2006/main" xmlns:w14="http://schemas.microsoft.com/office/word/2010/wordml" xmlns:w15="http://schemas.microsoft.com/office/word/2012/wordml" xmlns:w16cex="http://schemas.microsoft.com/office/word/2018/wordml/cex" xmlns:w16cid="http://schemas.microsoft.com/office/word/2016/wordml/cid" xmlns:w16="http://schemas.microsoft.com/office/word/2018/wordml" xmlns:w16du="http://schemas.microsoft.com/office/word/2023/wordml/word16du" xmlns:w16sdtdh="http://schemas.microsoft.com/office/word/2020/wordml/sdtdatahash" xmlns:w16sdtfl="http://schemas.microsoft.com/office/word/2024/wordml/sdtformatlock" xmlns:w16se="http://schemas.microsoft.com/office/word/2015/wordml/symex" mc:Ignorable="w14 w15 w16se w16cid w16 w16cex w16sdtdh w16sdtfl w16du">
+<w:styles xmlns:mc="http://schemas.openxmlformats.org/markup-compatibility/2006" xmlns:r="http://schemas.openxmlformats.org/officeDocument/2006/relationships" xmlns:w="http://schemas.openxmlformats.org/wordprocessingml/2006/main" xmlns:w14="http://schemas.microsoft.com/office/word/2010/wordml" xmlns:w15="http://schemas.microsoft.com/office/word/2012/wordml" xmlns:w16cex="http://schemas.microsoft.com/office/word/2018/wordml/cex" xmlns:w16cid="http://schemas.microsoft.com/office/word/2016/wordml/cid" xmlns:w16="http://schemas.microsoft.com/office/word/2018/wordml" xmlns:w16sdtdh="http://schemas.microsoft.com/office/word/2020/wordml/sdtdatahash" xmlns:w16se="http://schemas.microsoft.com/office/word/2015/wordml/symex" mc:Ignorable="w14 w15 w16se w16cid w16 w16cex w16sdtdh">
   <w:docDefaults>
     <w:rPrDefault>
       <w:rPr>

</xml_diff>